<commit_message>
fix de arquitectura y nombres polacos
</commit_message>
<xml_diff>
--- a/XPS_TO_PDF_SERVICE_DOCUMENTATION.docx
+++ b/XPS_TO_PDF_SERVICE_DOCUMENTATION.docx
@@ -5,10 +5,6 @@
     <w:p>
       <w:pPr>
         <w:pStyle w:val="Heading1"/>
-        <w:numPr>
-          <w:ilvl w:val="0"/>
-          <w:numId w:val="1"/>
-        </w:numPr>
         <w:bidi w:val="0"/>
         <w:spacing w:before="240" w:after="120"/>
         <w:ind w:hanging="0" w:start="0"/>
@@ -23,10 +19,6 @@
     <w:p>
       <w:pPr>
         <w:pStyle w:val="Heading2"/>
-        <w:numPr>
-          <w:ilvl w:val="1"/>
-          <w:numId w:val="1"/>
-        </w:numPr>
         <w:bidi w:val="0"/>
         <w:ind w:hanging="0" w:start="0"/>
         <w:jc w:val="start"/>
@@ -40,7 +32,7 @@
     <w:p>
       <w:pPr>
         <w:pStyle w:val="PreformattedText"/>
-        <w:shd w:val="clear" w:fill="E1E1E1"/>
+        <w:shd w:fill="E1E1E1" w:val="clear"/>
         <w:bidi w:val="0"/>
         <w:spacing w:before="0" w:after="283"/>
         <w:jc w:val="start"/>
@@ -48,7 +40,7 @@
       </w:pPr>
       <w:r>
         <w:rPr/>
-        <w:t>Tytan SQL -&gt; Microsoft XPS Document Writer -&gt; AutoHotkey -&gt; C:\XPS_OUT\*.xps</w:t>
+        <w:t>Tytan -&gt; Microsoft XPS Document Writer -&gt; AutoHotkey -&gt; C:\XPS_OUT\*.xps</w:t>
         <w:br/>
         <w:t xml:space="preserve">      -&gt; XpsToPdfService -&gt; GhostXPS -&gt; C:\PDF\*.pdf</w:t>
       </w:r>
@@ -62,16 +54,12 @@
       </w:pPr>
       <w:r>
         <w:rPr/>
-        <w:t>Tytan SQL is external and closed-source. The project contains an interactive AutoHotkey interceptor and a .NET Windows service because a Windows service cannot control desktop windows in the user's session.</w:t>
+        <w:t>Tytan/Biling SQL is external and closed-source. The project contains an interactive AutoHotkey interceptor and a .NET Windows service because a Windows service cannot control desktop windows in the user's session.</w:t>
       </w:r>
     </w:p>
     <w:p>
       <w:pPr>
         <w:pStyle w:val="Heading2"/>
-        <w:numPr>
-          <w:ilvl w:val="1"/>
-          <w:numId w:val="1"/>
-        </w:numPr>
         <w:bidi w:val="0"/>
         <w:ind w:hanging="0" w:start="0"/>
         <w:jc w:val="start"/>
@@ -85,7 +73,7 @@
     <w:p>
       <w:pPr>
         <w:pStyle w:val="PreformattedText"/>
-        <w:shd w:val="clear" w:fill="E1E1E1"/>
+        <w:shd w:fill="E1E1E1" w:val="clear"/>
         <w:bidi w:val="0"/>
         <w:spacing w:before="0" w:after="283"/>
         <w:jc w:val="start"/>
@@ -109,10 +97,6 @@
     <w:p>
       <w:pPr>
         <w:pStyle w:val="Heading2"/>
-        <w:numPr>
-          <w:ilvl w:val="1"/>
-          <w:numId w:val="1"/>
-        </w:numPr>
         <w:bidi w:val="0"/>
         <w:ind w:hanging="0" w:start="0"/>
         <w:jc w:val="start"/>
@@ -148,7 +132,7 @@
     <w:p>
       <w:pPr>
         <w:pStyle w:val="PreformattedText"/>
-        <w:shd w:val="clear" w:fill="E1E1E1"/>
+        <w:shd w:fill="E1E1E1" w:val="clear"/>
         <w:bidi w:val="0"/>
         <w:spacing w:before="0" w:after="283"/>
         <w:jc w:val="start"/>
@@ -170,7 +154,7 @@
       </w:pPr>
       <w:r>
         <w:rPr/>
-        <w:t xml:space="preserve">Tytan SQL's </w:t>
+        <w:t xml:space="preserve">Tytan's </w:t>
       </w:r>
       <w:r>
         <w:rPr>
@@ -180,13 +164,23 @@
       </w:r>
       <w:r>
         <w:rPr/>
-        <w:t xml:space="preserve"> window contains the authoritative identifier, for example:</w:t>
+        <w:t xml:space="preserve"> or Polish </w:t>
+      </w:r>
+      <w:r>
+        <w:rPr>
+          <w:rFonts w:ascii="Liberation Mono" w:hAnsi="Liberation Mono"/>
+        </w:rPr>
+        <w:t>Drukowanie</w:t>
+      </w:r>
+      <w:r>
+        <w:rPr/>
+        <w:t xml:space="preserve"> window contains the authoritative identifier, for example:</w:t>
       </w:r>
     </w:p>
     <w:p>
       <w:pPr>
         <w:pStyle w:val="PreformattedText"/>
-        <w:shd w:val="clear" w:fill="E1E1E1"/>
+        <w:shd w:fill="E1E1E1" w:val="clear"/>
         <w:bidi w:val="0"/>
         <w:spacing w:before="0" w:after="283"/>
         <w:jc w:val="start"/>
@@ -222,7 +216,7 @@
     <w:p>
       <w:pPr>
         <w:pStyle w:val="PreformattedText"/>
-        <w:shd w:val="clear" w:fill="E1E1E1"/>
+        <w:shd w:fill="E1E1E1" w:val="clear"/>
         <w:bidi w:val="0"/>
         <w:spacing w:before="0" w:after="283"/>
         <w:jc w:val="start"/>
@@ -255,7 +249,7 @@
     <w:p>
       <w:pPr>
         <w:pStyle w:val="PreformattedText"/>
-        <w:shd w:val="clear" w:fill="E1E1E1"/>
+        <w:shd w:fill="E1E1E1" w:val="clear"/>
         <w:bidi w:val="0"/>
         <w:spacing w:before="0" w:after="283"/>
         <w:jc w:val="start"/>
@@ -319,16 +313,22 @@
       </w:r>
       <w:r>
         <w:rPr/>
+        <w:t>/</w:t>
+      </w:r>
+      <w:r>
+        <w:rPr>
+          <w:rFonts w:ascii="Liberation Mono" w:hAnsi="Liberation Mono"/>
+        </w:rPr>
+        <w:t>Drukowanie</w:t>
+      </w:r>
+      <w:r>
+        <w:rPr/>
         <w:t xml:space="preserve"> window is missed. The application window title and the XPS-proposed name are not used as names.</w:t>
       </w:r>
     </w:p>
     <w:p>
       <w:pPr>
         <w:pStyle w:val="Heading2"/>
-        <w:numPr>
-          <w:ilvl w:val="1"/>
-          <w:numId w:val="1"/>
-        </w:numPr>
         <w:bidi w:val="0"/>
         <w:ind w:hanging="0" w:start="0"/>
         <w:jc w:val="start"/>
@@ -342,10 +342,6 @@
     <w:p>
       <w:pPr>
         <w:pStyle w:val="Heading3"/>
-        <w:numPr>
-          <w:ilvl w:val="2"/>
-          <w:numId w:val="1"/>
-        </w:numPr>
         <w:bidi w:val="0"/>
         <w:ind w:hanging="0" w:start="0"/>
         <w:jc w:val="start"/>
@@ -397,7 +393,7 @@
     <w:p>
       <w:pPr>
         <w:pStyle w:val="PreformattedText"/>
-        <w:shd w:val="clear" w:fill="E1E1E1"/>
+        <w:shd w:fill="E1E1E1" w:val="clear"/>
         <w:bidi w:val="0"/>
         <w:spacing w:before="0" w:after="283"/>
         <w:jc w:val="start"/>
@@ -435,7 +431,7 @@
     <w:p>
       <w:pPr>
         <w:pStyle w:val="PreformattedText"/>
-        <w:shd w:val="clear" w:fill="E1E1E1"/>
+        <w:shd w:fill="E1E1E1" w:val="clear"/>
         <w:bidi w:val="0"/>
         <w:spacing w:before="0" w:after="283"/>
         <w:jc w:val="start"/>
@@ -489,10 +485,6 @@
     <w:p>
       <w:pPr>
         <w:pStyle w:val="Heading3"/>
-        <w:numPr>
-          <w:ilvl w:val="2"/>
-          <w:numId w:val="1"/>
-        </w:numPr>
         <w:bidi w:val="0"/>
         <w:ind w:hanging="0" w:start="0"/>
         <w:jc w:val="start"/>
@@ -538,7 +530,7 @@
     <w:p>
       <w:pPr>
         <w:pStyle w:val="PreformattedText"/>
-        <w:shd w:val="clear" w:fill="E1E1E1"/>
+        <w:shd w:fill="E1E1E1" w:val="clear"/>
         <w:bidi w:val="0"/>
         <w:spacing w:before="0" w:after="283"/>
         <w:jc w:val="start"/>
@@ -570,7 +562,7 @@
     <w:p>
       <w:pPr>
         <w:pStyle w:val="PreformattedText"/>
-        <w:shd w:val="clear" w:fill="E1E1E1"/>
+        <w:shd w:fill="E1E1E1" w:val="clear"/>
         <w:bidi w:val="0"/>
         <w:spacing w:before="0" w:after="283"/>
         <w:jc w:val="start"/>
@@ -588,10 +580,6 @@
     <w:p>
       <w:pPr>
         <w:pStyle w:val="Heading3"/>
-        <w:numPr>
-          <w:ilvl w:val="2"/>
-          <w:numId w:val="1"/>
-        </w:numPr>
         <w:bidi w:val="0"/>
         <w:ind w:hanging="0" w:start="0"/>
         <w:jc w:val="start"/>
@@ -627,7 +615,7 @@
     <w:p>
       <w:pPr>
         <w:pStyle w:val="PreformattedText"/>
-        <w:shd w:val="clear" w:fill="E1E1E1"/>
+        <w:shd w:fill="E1E1E1" w:val="clear"/>
         <w:bidi w:val="0"/>
         <w:spacing w:before="0" w:after="283"/>
         <w:jc w:val="start"/>
@@ -655,10 +643,6 @@
     <w:p>
       <w:pPr>
         <w:pStyle w:val="Heading3"/>
-        <w:numPr>
-          <w:ilvl w:val="2"/>
-          <w:numId w:val="1"/>
-        </w:numPr>
         <w:bidi w:val="0"/>
         <w:ind w:hanging="0" w:start="0"/>
         <w:jc w:val="start"/>
@@ -694,7 +678,7 @@
     <w:p>
       <w:pPr>
         <w:pStyle w:val="PreformattedText"/>
-        <w:shd w:val="clear" w:fill="E1E1E1"/>
+        <w:shd w:fill="E1E1E1" w:val="clear"/>
         <w:bidi w:val="0"/>
         <w:spacing w:before="0" w:after="283"/>
         <w:jc w:val="start"/>
@@ -734,10 +718,6 @@
     <w:p>
       <w:pPr>
         <w:pStyle w:val="Heading3"/>
-        <w:numPr>
-          <w:ilvl w:val="2"/>
-          <w:numId w:val="1"/>
-        </w:numPr>
         <w:bidi w:val="0"/>
         <w:ind w:hanging="0" w:start="0"/>
         <w:jc w:val="start"/>
@@ -757,7 +737,7 @@
       </w:pPr>
       <w:r>
         <w:rPr/>
-        <w:t xml:space="preserve">Tytan SQL identifiers can begin with </w:t>
+        <w:t xml:space="preserve">Tytan identifiers can begin with </w:t>
       </w:r>
       <w:r>
         <w:rPr>
@@ -783,7 +763,7 @@
     <w:p>
       <w:pPr>
         <w:pStyle w:val="PreformattedText"/>
-        <w:shd w:val="clear" w:fill="E1E1E1"/>
+        <w:shd w:fill="E1E1E1" w:val="clear"/>
         <w:bidi w:val="0"/>
         <w:spacing w:before="0" w:after="283"/>
         <w:jc w:val="start"/>
@@ -809,10 +789,6 @@
     <w:p>
       <w:pPr>
         <w:pStyle w:val="Heading3"/>
-        <w:numPr>
-          <w:ilvl w:val="2"/>
-          <w:numId w:val="1"/>
-        </w:numPr>
         <w:bidi w:val="0"/>
         <w:ind w:hanging="0" w:start="0"/>
         <w:jc w:val="start"/>
@@ -858,7 +834,7 @@
     <w:p>
       <w:pPr>
         <w:pStyle w:val="PreformattedText"/>
-        <w:shd w:val="clear" w:fill="E1E1E1"/>
+        <w:shd w:fill="E1E1E1" w:val="clear"/>
         <w:bidi w:val="0"/>
         <w:spacing w:before="0" w:after="283"/>
         <w:jc w:val="start"/>
@@ -889,10 +865,6 @@
     <w:p>
       <w:pPr>
         <w:pStyle w:val="Heading2"/>
-        <w:numPr>
-          <w:ilvl w:val="1"/>
-          <w:numId w:val="1"/>
-        </w:numPr>
         <w:bidi w:val="0"/>
         <w:ind w:hanging="0" w:start="0"/>
         <w:jc w:val="start"/>
@@ -924,7 +896,7 @@
     <w:p>
       <w:pPr>
         <w:pStyle w:val="PreformattedText"/>
-        <w:shd w:val="clear" w:fill="E1E1E1"/>
+        <w:shd w:fill="E1E1E1" w:val="clear"/>
         <w:bidi w:val="0"/>
         <w:spacing w:before="0" w:after="283"/>
         <w:jc w:val="start"/>
@@ -1026,7 +998,7 @@
     <w:p>
       <w:pPr>
         <w:pStyle w:val="PreformattedText"/>
-        <w:shd w:val="clear" w:fill="E1E1E1"/>
+        <w:shd w:fill="E1E1E1" w:val="clear"/>
         <w:bidi w:val="0"/>
         <w:spacing w:before="0" w:after="283"/>
         <w:jc w:val="start"/>
@@ -1040,10 +1012,6 @@
     <w:p>
       <w:pPr>
         <w:pStyle w:val="Heading2"/>
-        <w:numPr>
-          <w:ilvl w:val="1"/>
-          <w:numId w:val="1"/>
-        </w:numPr>
         <w:bidi w:val="0"/>
         <w:ind w:hanging="0" w:start="0"/>
         <w:jc w:val="start"/>
@@ -1051,22 +1019,6 @@
       </w:pPr>
       <w:r>
         <w:rPr/>
-      </w:r>
-    </w:p>
-    <w:p>
-      <w:pPr>
-        <w:pStyle w:val="Heading2"/>
-        <w:numPr>
-          <w:ilvl w:val="1"/>
-          <w:numId w:val="1"/>
-        </w:numPr>
-        <w:bidi w:val="0"/>
-        <w:ind w:hanging="0" w:start="0"/>
-        <w:jc w:val="start"/>
-        <w:rPr/>
-      </w:pPr>
-      <w:r>
-        <w:rPr/>
         <w:t>Performance and maintenance</w:t>
       </w:r>
     </w:p>
@@ -1079,7 +1031,7 @@
       </w:pPr>
       <w:r>
         <w:rPr/>
-        <w:t>The service normally spends 2–5 seconds per XPS job. Tytan SQL creates jobs sequentially, so extra conversion threads do not improve a batch when no XPS jobs are waiting. The main cost is Microsoft XPS generation, followed by GhostXPS rendering.</w:t>
+        <w:t>The service normally spends 2–5 seconds per XPS job. Tytan creates jobs sequentially, so extra conversion threads do not improve a batch when no XPS jobs are waiting. The main cost is Microsoft XPS generation, followed by GhostXPS rendering.</w:t>
       </w:r>
     </w:p>
     <w:p>
@@ -1102,6 +1054,7 @@
           <w:numId w:val="2"/>
         </w:numPr>
         <w:tabs>
+          <w:tab w:val="clear" w:pos="709"/>
           <w:tab w:val="left" w:pos="709" w:leader="none"/>
         </w:tabs>
         <w:bidi w:val="0"/>
@@ -1142,6 +1095,7 @@
           <w:numId w:val="2"/>
         </w:numPr>
         <w:tabs>
+          <w:tab w:val="clear" w:pos="709"/>
           <w:tab w:val="left" w:pos="709" w:leader="none"/>
         </w:tabs>
         <w:bidi w:val="0"/>
@@ -1172,6 +1126,7 @@
           <w:numId w:val="2"/>
         </w:numPr>
         <w:tabs>
+          <w:tab w:val="clear" w:pos="709"/>
           <w:tab w:val="left" w:pos="709" w:leader="none"/>
         </w:tabs>
         <w:bidi w:val="0"/>
@@ -1181,7 +1136,7 @@
       </w:pPr>
       <w:r>
         <w:rPr/>
-        <w:t>Test a multi-document Tytan SQL print.</w:t>
+        <w:t>Test a multi-document Tytan print.</w:t>
       </w:r>
     </w:p>
     <w:p>
@@ -1192,6 +1147,7 @@
           <w:numId w:val="2"/>
         </w:numPr>
         <w:tabs>
+          <w:tab w:val="clear" w:pos="709"/>
           <w:tab w:val="left" w:pos="709" w:leader="none"/>
         </w:tabs>
         <w:bidi w:val="0"/>
@@ -1212,6 +1168,7 @@
           <w:numId w:val="2"/>
         </w:numPr>
         <w:tabs>
+          <w:tab w:val="clear" w:pos="709"/>
           <w:tab w:val="left" w:pos="709" w:leader="none"/>
         </w:tabs>
         <w:bidi w:val="0"/>
@@ -1232,6 +1189,7 @@
           <w:numId w:val="2"/>
         </w:numPr>
         <w:tabs>
+          <w:tab w:val="clear" w:pos="709"/>
           <w:tab w:val="left" w:pos="709" w:leader="none"/>
         </w:tabs>
         <w:bidi w:val="0"/>
@@ -1252,6 +1210,7 @@
           <w:numId w:val="2"/>
         </w:numPr>
         <w:tabs>
+          <w:tab w:val="clear" w:pos="709"/>
           <w:tab w:val="left" w:pos="709" w:leader="none"/>
         </w:tabs>
         <w:bidi w:val="0"/>
@@ -1283,7 +1242,6 @@
       <w:pgNumType w:fmt="decimal"/>
       <w:formProt w:val="false"/>
       <w:textDirection w:val="lrTb"/>
-      <w:docGrid w:type="default" w:linePitch="100" w:charSpace="0"/>
     </w:sectPr>
   </w:body>
 </w:document>
@@ -1295,6 +1253,7 @@
     <w:lvl w:ilvl="0">
       <w:start w:val="1"/>
       <w:numFmt w:val="none"/>
+      <w:pStyle w:val="Heading1"/>
       <w:suff w:val="nothing"/>
       <w:lvlText w:val=""/>
       <w:lvlJc w:val="start"/>
@@ -1304,11 +1263,11 @@
         </w:tabs>
         <w:ind w:start="0" w:hanging="0"/>
       </w:pPr>
-      <w:rPr/>
     </w:lvl>
     <w:lvl w:ilvl="1">
       <w:start w:val="1"/>
       <w:numFmt w:val="none"/>
+      <w:pStyle w:val="Heading2"/>
       <w:suff w:val="nothing"/>
       <w:lvlText w:val=""/>
       <w:lvlJc w:val="start"/>
@@ -1318,11 +1277,11 @@
         </w:tabs>
         <w:ind w:start="0" w:hanging="0"/>
       </w:pPr>
-      <w:rPr/>
     </w:lvl>
     <w:lvl w:ilvl="2">
       <w:start w:val="1"/>
       <w:numFmt w:val="none"/>
+      <w:pStyle w:val="Heading3"/>
       <w:suff w:val="nothing"/>
       <w:lvlText w:val=""/>
       <w:lvlJc w:val="start"/>
@@ -1332,7 +1291,6 @@
         </w:tabs>
         <w:ind w:start="0" w:hanging="0"/>
       </w:pPr>
-      <w:rPr/>
     </w:lvl>
     <w:lvl w:ilvl="3">
       <w:start w:val="1"/>
@@ -1346,7 +1304,6 @@
         </w:tabs>
         <w:ind w:start="0" w:hanging="0"/>
       </w:pPr>
-      <w:rPr/>
     </w:lvl>
     <w:lvl w:ilvl="4">
       <w:start w:val="1"/>
@@ -1360,7 +1317,6 @@
         </w:tabs>
         <w:ind w:start="0" w:hanging="0"/>
       </w:pPr>
-      <w:rPr/>
     </w:lvl>
     <w:lvl w:ilvl="5">
       <w:start w:val="1"/>
@@ -1374,7 +1330,6 @@
         </w:tabs>
         <w:ind w:start="0" w:hanging="0"/>
       </w:pPr>
-      <w:rPr/>
     </w:lvl>
     <w:lvl w:ilvl="6">
       <w:start w:val="1"/>
@@ -1388,7 +1343,6 @@
         </w:tabs>
         <w:ind w:start="0" w:hanging="0"/>
       </w:pPr>
-      <w:rPr/>
     </w:lvl>
     <w:lvl w:ilvl="7">
       <w:start w:val="1"/>
@@ -1402,7 +1356,6 @@
         </w:tabs>
         <w:ind w:start="0" w:hanging="0"/>
       </w:pPr>
-      <w:rPr/>
     </w:lvl>
     <w:lvl w:ilvl="8">
       <w:start w:val="1"/>
@@ -1416,7 +1369,6 @@
         </w:tabs>
         <w:ind w:start="0" w:hanging="0"/>
       </w:pPr>
-      <w:rPr/>
     </w:lvl>
   </w:abstractNum>
   <w:abstractNum w:abstractNumId="2">
@@ -1556,133 +1508,11 @@
       </w:rPr>
     </w:lvl>
   </w:abstractNum>
-  <w:abstractNum w:abstractNumId="3">
-    <w:lvl w:ilvl="0">
-      <w:start w:val="1"/>
-      <w:numFmt w:val="none"/>
-      <w:suff w:val="nothing"/>
-      <w:lvlText w:val=""/>
-      <w:lvlJc w:val="start"/>
-      <w:pPr>
-        <w:tabs>
-          <w:tab w:val="num" w:pos="0"/>
-        </w:tabs>
-        <w:ind w:start="0" w:hanging="0"/>
-      </w:pPr>
-    </w:lvl>
-    <w:lvl w:ilvl="1">
-      <w:start w:val="1"/>
-      <w:numFmt w:val="none"/>
-      <w:suff w:val="nothing"/>
-      <w:lvlText w:val=""/>
-      <w:lvlJc w:val="start"/>
-      <w:pPr>
-        <w:tabs>
-          <w:tab w:val="num" w:pos="0"/>
-        </w:tabs>
-        <w:ind w:start="0" w:hanging="0"/>
-      </w:pPr>
-    </w:lvl>
-    <w:lvl w:ilvl="2">
-      <w:start w:val="1"/>
-      <w:numFmt w:val="none"/>
-      <w:suff w:val="nothing"/>
-      <w:lvlText w:val=""/>
-      <w:lvlJc w:val="start"/>
-      <w:pPr>
-        <w:tabs>
-          <w:tab w:val="num" w:pos="0"/>
-        </w:tabs>
-        <w:ind w:start="0" w:hanging="0"/>
-      </w:pPr>
-    </w:lvl>
-    <w:lvl w:ilvl="3">
-      <w:start w:val="1"/>
-      <w:numFmt w:val="none"/>
-      <w:suff w:val="nothing"/>
-      <w:lvlText w:val=""/>
-      <w:lvlJc w:val="start"/>
-      <w:pPr>
-        <w:tabs>
-          <w:tab w:val="num" w:pos="0"/>
-        </w:tabs>
-        <w:ind w:start="0" w:hanging="0"/>
-      </w:pPr>
-    </w:lvl>
-    <w:lvl w:ilvl="4">
-      <w:start w:val="1"/>
-      <w:numFmt w:val="none"/>
-      <w:suff w:val="nothing"/>
-      <w:lvlText w:val=""/>
-      <w:lvlJc w:val="start"/>
-      <w:pPr>
-        <w:tabs>
-          <w:tab w:val="num" w:pos="0"/>
-        </w:tabs>
-        <w:ind w:start="0" w:hanging="0"/>
-      </w:pPr>
-    </w:lvl>
-    <w:lvl w:ilvl="5">
-      <w:start w:val="1"/>
-      <w:numFmt w:val="none"/>
-      <w:suff w:val="nothing"/>
-      <w:lvlText w:val=""/>
-      <w:lvlJc w:val="start"/>
-      <w:pPr>
-        <w:tabs>
-          <w:tab w:val="num" w:pos="0"/>
-        </w:tabs>
-        <w:ind w:start="0" w:hanging="0"/>
-      </w:pPr>
-    </w:lvl>
-    <w:lvl w:ilvl="6">
-      <w:start w:val="1"/>
-      <w:numFmt w:val="none"/>
-      <w:suff w:val="nothing"/>
-      <w:lvlText w:val=""/>
-      <w:lvlJc w:val="start"/>
-      <w:pPr>
-        <w:tabs>
-          <w:tab w:val="num" w:pos="0"/>
-        </w:tabs>
-        <w:ind w:start="0" w:hanging="0"/>
-      </w:pPr>
-    </w:lvl>
-    <w:lvl w:ilvl="7">
-      <w:start w:val="1"/>
-      <w:numFmt w:val="none"/>
-      <w:suff w:val="nothing"/>
-      <w:lvlText w:val=""/>
-      <w:lvlJc w:val="start"/>
-      <w:pPr>
-        <w:tabs>
-          <w:tab w:val="num" w:pos="0"/>
-        </w:tabs>
-        <w:ind w:start="0" w:hanging="0"/>
-      </w:pPr>
-    </w:lvl>
-    <w:lvl w:ilvl="8">
-      <w:start w:val="1"/>
-      <w:numFmt w:val="none"/>
-      <w:suff w:val="nothing"/>
-      <w:lvlText w:val=""/>
-      <w:lvlJc w:val="start"/>
-      <w:pPr>
-        <w:tabs>
-          <w:tab w:val="num" w:pos="0"/>
-        </w:tabs>
-        <w:ind w:start="0" w:hanging="0"/>
-      </w:pPr>
-    </w:lvl>
-  </w:abstractNum>
   <w:num w:numId="1">
     <w:abstractNumId w:val="1"/>
   </w:num>
   <w:num w:numId="2">
     <w:abstractNumId w:val="2"/>
-  </w:num>
-  <w:num w:numId="3">
-    <w:abstractNumId w:val="3"/>
   </w:num>
 </w:numbering>
 </file>
@@ -1709,15 +1539,11 @@
     <w:qFormat/>
     <w:pPr>
       <w:widowControl w:val="false"/>
-      <w:suppressAutoHyphens w:val="true"/>
       <w:bidi w:val="0"/>
-      <w:spacing w:before="0" w:after="0"/>
-      <w:jc w:val="start"/>
     </w:pPr>
     <w:rPr>
       <w:rFonts w:ascii="Liberation Serif" w:hAnsi="Liberation Serif" w:eastAsia="NSimSun" w:cs="Arial"/>
       <w:color w:val="auto"/>
-      <w:kern w:val="0"/>
       <w:sz w:val="24"/>
       <w:szCs w:val="24"/>
       <w:lang w:val="en-GB" w:eastAsia="zh-CN" w:bidi="hi-IN"/>
@@ -1861,29 +1687,6 @@
       <w:szCs w:val="20"/>
     </w:rPr>
   </w:style>
-  <w:style w:type="paragraph" w:styleId="TableContents">
-    <w:name w:val="Table Contents"/>
-    <w:basedOn w:val="Normal"/>
-    <w:qFormat/>
-    <w:pPr>
-      <w:widowControl w:val="false"/>
-      <w:suppressLineNumbers/>
-    </w:pPr>
-    <w:rPr/>
-  </w:style>
-  <w:style w:type="paragraph" w:styleId="TableHeading">
-    <w:name w:val="Table Heading"/>
-    <w:basedOn w:val="TableContents"/>
-    <w:qFormat/>
-    <w:pPr>
-      <w:suppressLineNumbers/>
-      <w:jc w:val="center"/>
-    </w:pPr>
-    <w:rPr>
-      <w:b/>
-      <w:bCs/>
-    </w:rPr>
-  </w:style>
 </w:styles>
 </file>
 

</xml_diff>

<commit_message>
cambio de XpsToPdfService a TytanXpsToPdf
</commit_message>
<xml_diff>
--- a/XPS_TO_PDF_SERVICE_DOCUMENTATION.docx
+++ b/XPS_TO_PDF_SERVICE_DOCUMENTATION.docx
@@ -929,7 +929,7 @@
         <w:br/>
         <w:t>{</w:t>
         <w:br/>
-        <w:t xml:space="preserve">    options.ServiceName = "XpsToPdfService";</w:t>
+        <w:t xml:space="preserve">    options.ServiceName = "TytanXpsToPdf";</w:t>
         <w:br/>
         <w:t>});</w:t>
         <w:br/>
@@ -1027,7 +1027,7 @@
       </w:pPr>
       <w:r>
         <w:rPr/>
-        <w:t>start "" "C:\Program Files\XpsToPdfService\SaveAsInterceptor\AutoHotkey64.exe" "C:\Program Files\XpsToPdfService\SaveAsInterceptor\saveas_xps.ahk"</w:t>
+        <w:t>start "" "C:\Program Files\TytanXpsToPdf\SaveAsInterceptor\AutoHotkey64.exe" "C:\Program Files\TytanXpsToPdf\SaveAsInterceptor\saveas_xps.ahk"</w:t>
       </w:r>
     </w:p>
     <w:p>

</xml_diff>